<commit_message>
Update headline, certifications and skills on site and resume
- Headline is now "Full-Stack (MERN), Agentic AI and Gen AI Developer" on
  the hero, page metadata and both resume files.
- Remove Apache Spark and Delta Lake from the GenAI skills.
- Drop "Databricks Certified" wording from the Generative AI Engineer
  Associate mention (resume summary and certification entry, page metadata).
- Use the exact Anthropic course names on the site (Introduction to
  Subagents, Introduction to Agent Skills, AI Fluency: Framework &
  Foundations) and list all seven Anthropic certificates on the resume.

Co-Authored-By: Claude Sonnet 5.5 <noreply@anthropic.com>
Claude-Session: https://claude.ai/code/session_013bSXhU6JZZNB6S5iSrXEzA
</commit_message>
<xml_diff>
--- a/public/Pradeep_Kumar_S_Resume.docx
+++ b/public/Pradeep_Kumar_S_Resume.docx
@@ -33,7 +33,7 @@
           <w:sz w:val="22"/>
           <w:szCs w:val="22"/>
         </w:rPr>
-        <w:t xml:space="preserve">Full-Stack Developer · Backend &amp; Generative AI Systems</w:t>
+        <w:t xml:space="preserve">Full-Stack (MERN), Agentic AI and Gen AI Developer</w:t>
       </w:r>
     </w:p>
     <w:p>
@@ -154,7 +154,7 @@
           <w:sz w:val="20"/>
           <w:szCs w:val="20"/>
         </w:rPr>
-        <w:t xml:space="preserve">Full-stack developer with 2+ years of experience designing and shipping production platforms on the MERN stack and Next.js, now extending that foundation into Generative AI and agentic systems. Specialises in API-first backends (500+ REST endpoints delivered, JWT authentication, a hiring-platform backend sustaining 600 concurrent users) and in RAG pipelines and LLM tooling built with LangChain, the Gemini API and FAISS. Databricks Certified (Data Engineer Associate, Generative AI Engineer Associate) and Anthropic-certified across the Claude API, Claude Code, MCP and agent skills, with 10+ platforms delivered across startup acceleration, ed-tech and AI-first recruitment.</w:t>
+        <w:t xml:space="preserve">Full-stack developer with 2+ years of experience designing and shipping production platforms on the MERN stack and Next.js, now extending that foundation into Generative AI and agentic systems. Specialises in API-first backends (500+ REST endpoints delivered, JWT authentication, a hiring-platform backend sustaining 600 concurrent users) and in RAG pipelines and LLM tooling built with LangChain, the Gemini API and FAISS. Holds the Databricks Certified Data Engineer Associate and Databricks Generative AI Engineer Associate credentials, plus Anthropic certificates across the Claude API, Claude Code, MCP, subagents and agent skills, with 10+ platforms delivered across startup acceleration, ed-tech and AI-first recruitment.</w:t>
       </w:r>
     </w:p>
     <w:p>
@@ -1283,52 +1283,34 @@
           <w:sz w:val="20"/>
           <w:szCs w:val="20"/>
         </w:rPr>
-        <w:t xml:space="preserve"> · Databricks</w:t>
-      </w:r>
-      <w:r>
-        <w:rPr>
-          <w:rFonts w:ascii="Arial" w:cs="Arial" w:eastAsia="Arial" w:hAnsi="Arial"/>
-          <w:color w:val="595959"/>
-          <w:sz w:val="20"/>
-          <w:szCs w:val="20"/>
-        </w:rPr>
-        <w:t xml:space="preserve">	May 2026</w:t>
-      </w:r>
-    </w:p>
-    <w:p>
-      <w:pPr>
-        <w:tabs>
-          <w:tab w:val="right" w:pos="10466"/>
-        </w:tabs>
-        <w:spacing w:after="30"/>
-      </w:pPr>
-      <w:r>
-        <w:rPr>
-          <w:rFonts w:ascii="Arial" w:cs="Arial" w:eastAsia="Arial" w:hAnsi="Arial"/>
-          <w:b/>
-          <w:bCs/>
-          <w:sz w:val="20"/>
-          <w:szCs w:val="20"/>
-        </w:rPr>
-        <w:t xml:space="preserve">Databricks Certified Generative AI Engineer Associate</w:t>
-      </w:r>
-      <w:r>
-        <w:rPr>
-          <w:rFonts w:ascii="Arial" w:cs="Arial" w:eastAsia="Arial" w:hAnsi="Arial"/>
-          <w:color w:val="595959"/>
-          <w:sz w:val="20"/>
-          <w:szCs w:val="20"/>
-        </w:rPr>
-        <w:t xml:space="preserve"> · Databricks</w:t>
-      </w:r>
-      <w:r>
-        <w:rPr>
-          <w:rFonts w:ascii="Arial" w:cs="Arial" w:eastAsia="Arial" w:hAnsi="Arial"/>
-          <w:color w:val="595959"/>
-          <w:sz w:val="20"/>
-          <w:szCs w:val="20"/>
-        </w:rPr>
-        <w:t xml:space="preserve">	Jan 2026</w:t>
+        <w:t xml:space="preserve"> · Databricks	May 2026</w:t>
+      </w:r>
+    </w:p>
+    <w:p>
+      <w:pPr>
+        <w:tabs>
+          <w:tab w:val="right" w:pos="10466"/>
+        </w:tabs>
+        <w:spacing w:after="30"/>
+      </w:pPr>
+      <w:r>
+        <w:rPr>
+          <w:rFonts w:ascii="Arial" w:cs="Arial" w:eastAsia="Arial" w:hAnsi="Arial"/>
+          <w:b/>
+          <w:bCs/>
+          <w:sz w:val="20"/>
+          <w:szCs w:val="20"/>
+        </w:rPr>
+        <w:t xml:space="preserve">Generative AI Engineer Associate</w:t>
+      </w:r>
+      <w:r>
+        <w:rPr>
+          <w:rFonts w:ascii="Arial" w:cs="Arial" w:eastAsia="Arial" w:hAnsi="Arial"/>
+          <w:color w:val="595959"/>
+          <w:sz w:val="20"/>
+          <w:szCs w:val="20"/>
+        </w:rPr>
+        <w:t xml:space="preserve"> · Databricks	Jan 2026</w:t>
       </w:r>
     </w:p>
     <w:p>
@@ -1355,16 +1337,61 @@
           <w:sz w:val="20"/>
           <w:szCs w:val="20"/>
         </w:rPr>
-        <w:t xml:space="preserve"> · Anthropic</w:t>
-      </w:r>
-      <w:r>
-        <w:rPr>
-          <w:rFonts w:ascii="Arial" w:cs="Arial" w:eastAsia="Arial" w:hAnsi="Arial"/>
-          <w:color w:val="595959"/>
-          <w:sz w:val="20"/>
-          <w:szCs w:val="20"/>
-        </w:rPr>
-        <w:t xml:space="preserve">	Jul 2026</w:t>
+        <w:t xml:space="preserve"> · Anthropic	Jul 2026</w:t>
+      </w:r>
+    </w:p>
+    <w:p>
+      <w:pPr>
+        <w:tabs>
+          <w:tab w:val="right" w:pos="10466"/>
+        </w:tabs>
+        <w:spacing w:after="30"/>
+      </w:pPr>
+      <w:r>
+        <w:rPr>
+          <w:rFonts w:ascii="Arial" w:cs="Arial" w:eastAsia="Arial" w:hAnsi="Arial"/>
+          <w:b/>
+          <w:bCs/>
+          <w:sz w:val="20"/>
+          <w:szCs w:val="20"/>
+        </w:rPr>
+        <w:t xml:space="preserve">Introduction to Subagents</w:t>
+      </w:r>
+      <w:r>
+        <w:rPr>
+          <w:rFonts w:ascii="Arial" w:cs="Arial" w:eastAsia="Arial" w:hAnsi="Arial"/>
+          <w:color w:val="595959"/>
+          <w:sz w:val="20"/>
+          <w:szCs w:val="20"/>
+        </w:rPr>
+        <w:t xml:space="preserve"> · Anthropic	Jul 2026</w:t>
+      </w:r>
+    </w:p>
+    <w:p>
+      <w:pPr>
+        <w:tabs>
+          <w:tab w:val="right" w:pos="10466"/>
+        </w:tabs>
+        <w:spacing w:after="30"/>
+      </w:pPr>
+      <w:r>
+        <w:rPr>
+          <w:rFonts w:ascii="Arial" w:cs="Arial" w:eastAsia="Arial" w:hAnsi="Arial"/>
+          <w:b/>
+          <w:bCs/>
+          <w:sz w:val="20"/>
+          <w:szCs w:val="20"/>
+        </w:rPr>
+        <w:t xml:space="preserve">Introduction to Model Context Protocol</w:t>
+      </w:r>
+      <w:r>
+        <w:rPr>
+          <w:rFonts w:ascii="Arial" w:cs="Arial" w:eastAsia="Arial" w:hAnsi="Arial"/>
+          <w:color w:val="595959"/>
+          <w:sz w:val="20"/>
+          <w:szCs w:val="20"/>
+        </w:rPr>
+        <w:t xml:space="preserve"> · Anthropic	Jun 2026</w:t>
       </w:r>
     </w:p>
     <w:p>
@@ -1391,16 +1418,7 @@
           <w:sz w:val="20"/>
           <w:szCs w:val="20"/>
         </w:rPr>
-        <w:t xml:space="preserve"> · Anthropic</w:t>
-      </w:r>
-      <w:r>
-        <w:rPr>
-          <w:rFonts w:ascii="Arial" w:cs="Arial" w:eastAsia="Arial" w:hAnsi="Arial"/>
-          <w:color w:val="595959"/>
-          <w:sz w:val="20"/>
-          <w:szCs w:val="20"/>
-        </w:rPr>
-        <w:t xml:space="preserve">	Jun 2026</w:t>
+        <w:t xml:space="preserve"> · Anthropic	Jun 2026</w:t>
       </w:r>
     </w:p>
     <w:p>
@@ -1427,52 +1445,61 @@
           <w:sz w:val="20"/>
           <w:szCs w:val="20"/>
         </w:rPr>
-        <w:t xml:space="preserve"> · Anthropic</w:t>
-      </w:r>
-      <w:r>
-        <w:rPr>
-          <w:rFonts w:ascii="Arial" w:cs="Arial" w:eastAsia="Arial" w:hAnsi="Arial"/>
-          <w:color w:val="595959"/>
-          <w:sz w:val="20"/>
-          <w:szCs w:val="20"/>
-        </w:rPr>
-        <w:t xml:space="preserve">	Jun 2026</w:t>
-      </w:r>
-    </w:p>
-    <w:p>
-      <w:pPr>
-        <w:tabs>
-          <w:tab w:val="right" w:pos="10466"/>
-        </w:tabs>
-        <w:spacing w:after="30"/>
-      </w:pPr>
-      <w:r>
-        <w:rPr>
-          <w:rFonts w:ascii="Arial" w:cs="Arial" w:eastAsia="Arial" w:hAnsi="Arial"/>
-          <w:b/>
-          <w:bCs/>
-          <w:sz w:val="20"/>
-          <w:szCs w:val="20"/>
-        </w:rPr>
-        <w:t xml:space="preserve">AI Fluency Framework &amp; Agent Skills</w:t>
-      </w:r>
-      <w:r>
-        <w:rPr>
-          <w:rFonts w:ascii="Arial" w:cs="Arial" w:eastAsia="Arial" w:hAnsi="Arial"/>
-          <w:color w:val="595959"/>
-          <w:sz w:val="20"/>
-          <w:szCs w:val="20"/>
-        </w:rPr>
-        <w:t xml:space="preserve"> · Anthropic</w:t>
-      </w:r>
-      <w:r>
-        <w:rPr>
-          <w:rFonts w:ascii="Arial" w:cs="Arial" w:eastAsia="Arial" w:hAnsi="Arial"/>
-          <w:color w:val="595959"/>
-          <w:sz w:val="20"/>
-          <w:szCs w:val="20"/>
-        </w:rPr>
-        <w:t xml:space="preserve">	Jun 2026</w:t>
+        <w:t xml:space="preserve"> · Anthropic	Jun 2026</w:t>
+      </w:r>
+    </w:p>
+    <w:p>
+      <w:pPr>
+        <w:tabs>
+          <w:tab w:val="right" w:pos="10466"/>
+        </w:tabs>
+        <w:spacing w:after="30"/>
+      </w:pPr>
+      <w:r>
+        <w:rPr>
+          <w:rFonts w:ascii="Arial" w:cs="Arial" w:eastAsia="Arial" w:hAnsi="Arial"/>
+          <w:b/>
+          <w:bCs/>
+          <w:sz w:val="20"/>
+          <w:szCs w:val="20"/>
+        </w:rPr>
+        <w:t xml:space="preserve">Introduction to Agent Skills</w:t>
+      </w:r>
+      <w:r>
+        <w:rPr>
+          <w:rFonts w:ascii="Arial" w:cs="Arial" w:eastAsia="Arial" w:hAnsi="Arial"/>
+          <w:color w:val="595959"/>
+          <w:sz w:val="20"/>
+          <w:szCs w:val="20"/>
+        </w:rPr>
+        <w:t xml:space="preserve"> · Anthropic	Jun 2026</w:t>
+      </w:r>
+    </w:p>
+    <w:p>
+      <w:pPr>
+        <w:tabs>
+          <w:tab w:val="right" w:pos="10466"/>
+        </w:tabs>
+        <w:spacing w:after="30"/>
+      </w:pPr>
+      <w:r>
+        <w:rPr>
+          <w:rFonts w:ascii="Arial" w:cs="Arial" w:eastAsia="Arial" w:hAnsi="Arial"/>
+          <w:b/>
+          <w:bCs/>
+          <w:sz w:val="20"/>
+          <w:szCs w:val="20"/>
+        </w:rPr>
+        <w:t xml:space="preserve">AI Fluency: Framework &amp; Foundations</w:t>
+      </w:r>
+      <w:r>
+        <w:rPr>
+          <w:rFonts w:ascii="Arial" w:cs="Arial" w:eastAsia="Arial" w:hAnsi="Arial"/>
+          <w:color w:val="595959"/>
+          <w:sz w:val="20"/>
+          <w:szCs w:val="20"/>
+        </w:rPr>
+        <w:t xml:space="preserve"> · Anthropic	Jun 2026</w:t>
       </w:r>
     </w:p>
     <w:p>
@@ -1499,16 +1526,7 @@
           <w:sz w:val="20"/>
           <w:szCs w:val="20"/>
         </w:rPr>
-        <w:t xml:space="preserve"> · HCL GUVI</w:t>
-      </w:r>
-      <w:r>
-        <w:rPr>
-          <w:rFonts w:ascii="Arial" w:cs="Arial" w:eastAsia="Arial" w:hAnsi="Arial"/>
-          <w:color w:val="595959"/>
-          <w:sz w:val="20"/>
-          <w:szCs w:val="20"/>
-        </w:rPr>
-        <w:t xml:space="preserve">	May 2025</w:t>
+        <w:t xml:space="preserve"> · HCL GUVI	May 2025</w:t>
       </w:r>
     </w:p>
     <w:p>
@@ -1535,16 +1553,7 @@
           <w:sz w:val="20"/>
           <w:szCs w:val="20"/>
         </w:rPr>
-        <w:t xml:space="preserve"> · PrepInsta</w:t>
-      </w:r>
-      <w:r>
-        <w:rPr>
-          <w:rFonts w:ascii="Arial" w:cs="Arial" w:eastAsia="Arial" w:hAnsi="Arial"/>
-          <w:color w:val="595959"/>
-          <w:sz w:val="20"/>
-          <w:szCs w:val="20"/>
-        </w:rPr>
-        <w:t xml:space="preserve">	Feb 2024</w:t>
+        <w:t xml:space="preserve"> · PrepInsta	Feb 2024</w:t>
       </w:r>
     </w:p>
     <w:p>
@@ -1571,16 +1580,7 @@
           <w:sz w:val="20"/>
           <w:szCs w:val="20"/>
         </w:rPr>
-        <w:t xml:space="preserve"> · NPTEL</w:t>
-      </w:r>
-      <w:r>
-        <w:rPr>
-          <w:rFonts w:ascii="Arial" w:cs="Arial" w:eastAsia="Arial" w:hAnsi="Arial"/>
-          <w:color w:val="595959"/>
-          <w:sz w:val="20"/>
-          <w:szCs w:val="20"/>
-        </w:rPr>
-        <w:t xml:space="preserve">	2023</w:t>
+        <w:t xml:space="preserve"> · NPTEL	2023</w:t>
       </w:r>
     </w:p>
     <w:p>
@@ -1607,16 +1607,7 @@
           <w:sz w:val="20"/>
           <w:szCs w:val="20"/>
         </w:rPr>
-        <w:t xml:space="preserve"> · IBM</w:t>
-      </w:r>
-      <w:r>
-        <w:rPr>
-          <w:rFonts w:ascii="Arial" w:cs="Arial" w:eastAsia="Arial" w:hAnsi="Arial"/>
-          <w:color w:val="595959"/>
-          <w:sz w:val="20"/>
-          <w:szCs w:val="20"/>
-        </w:rPr>
-        <w:t xml:space="preserve">	Mar 2022</w:t>
+        <w:t xml:space="preserve"> · IBM	Mar 2022</w:t>
       </w:r>
     </w:p>
     <w:p>
@@ -1664,16 +1655,7 @@
           <w:sz w:val="20"/>
           <w:szCs w:val="20"/>
         </w:rPr>
-        <w:t xml:space="preserve"> · SNS Institutions, Coimbatore, India</w:t>
-      </w:r>
-      <w:r>
-        <w:rPr>
-          <w:rFonts w:ascii="Arial" w:cs="Arial" w:eastAsia="Arial" w:hAnsi="Arial"/>
-          <w:color w:val="595959"/>
-          <w:sz w:val="20"/>
-          <w:szCs w:val="20"/>
-        </w:rPr>
-        <w:t xml:space="preserve">	2021 – 2024</w:t>
+        <w:t xml:space="preserve"> · SNS Institutions, Coimbatore, India	2021 – 2024</w:t>
       </w:r>
     </w:p>
     <w:p>
@@ -1700,16 +1682,7 @@
           <w:sz w:val="20"/>
           <w:szCs w:val="20"/>
         </w:rPr>
-        <w:t xml:space="preserve"> · Sri Ramakrishna Degree College (Autonomous), Coimbatore, India</w:t>
-      </w:r>
-      <w:r>
-        <w:rPr>
-          <w:rFonts w:ascii="Arial" w:cs="Arial" w:eastAsia="Arial" w:hAnsi="Arial"/>
-          <w:color w:val="595959"/>
-          <w:sz w:val="20"/>
-          <w:szCs w:val="20"/>
-        </w:rPr>
-        <w:t xml:space="preserve">	2020</w:t>
+        <w:t xml:space="preserve"> · Sri Ramakrishna Degree College (Autonomous), Coimbatore, India	2020</w:t>
       </w:r>
     </w:p>
     <w:p>
@@ -1736,16 +1709,7 @@
           <w:sz w:val="20"/>
           <w:szCs w:val="20"/>
         </w:rPr>
-        <w:t xml:space="preserve"> · Christus Rex Higher Secondary School, Ooty, India</w:t>
-      </w:r>
-      <w:r>
-        <w:rPr>
-          <w:rFonts w:ascii="Arial" w:cs="Arial" w:eastAsia="Arial" w:hAnsi="Arial"/>
-          <w:color w:val="595959"/>
-          <w:sz w:val="20"/>
-          <w:szCs w:val="20"/>
-        </w:rPr>
-        <w:t xml:space="preserve">	2018</w:t>
+        <w:t xml:space="preserve"> · Christus Rex Higher Secondary School, Ooty, India	2018</w:t>
       </w:r>
     </w:p>
     <w:sectPr>

</xml_diff>

<commit_message>
Drop "Databricks Certified" wording from Data Engineer Associate
Match the Generative AI Engineer Associate entry: the issuer is already
shown as Databricks, so the cards and resume list "Data Engineer
Associate" and "Generative AI Engineer Associate". Updates the
certification card, About text, page metadata, and the resume summary
and certification entry (PDF and DOCX).

Co-Authored-By: Claude Sonnet 5.5 <noreply@anthropic.com>
Claude-Session: https://claude.ai/code/session_013bSXhU6JZZNB6S5iSrXEzA
</commit_message>
<xml_diff>
--- a/public/Pradeep_Kumar_S_Resume.docx
+++ b/public/Pradeep_Kumar_S_Resume.docx
@@ -154,7 +154,7 @@
           <w:sz w:val="20"/>
           <w:szCs w:val="20"/>
         </w:rPr>
-        <w:t xml:space="preserve">Full-stack developer with 2+ years of experience designing and shipping production platforms on the MERN stack and Next.js, now extending that foundation into Generative AI and agentic systems. Specialises in API-first backends (500+ REST endpoints delivered, JWT authentication, a hiring-platform backend sustaining 600 concurrent users) and in RAG pipelines and LLM tooling built with LangChain, the Gemini API and FAISS. Holds the Databricks Certified Data Engineer Associate and Databricks Generative AI Engineer Associate credentials, plus Anthropic certificates across the Claude API, Claude Code, MCP, subagents and agent skills, with 10+ platforms delivered across startup acceleration, ed-tech and AI-first recruitment.</w:t>
+        <w:t xml:space="preserve">Full-stack developer with 2+ years of experience designing and shipping production platforms on the MERN stack and Next.js, now extending that foundation into Generative AI and agentic systems. Specialises in API-first backends (500+ REST endpoints delivered, JWT authentication, a hiring-platform backend sustaining 600 concurrent users) and in RAG pipelines and LLM tooling built with LangChain, the Gemini API and FAISS. Holds the Databricks Data Engineer Associate and Generative AI Engineer Associate credentials, plus Anthropic certificates across the Claude API, Claude Code, MCP, subagents and agent skills, with 10+ platforms delivered across startup acceleration, ed-tech and AI-first recruitment.</w:t>
       </w:r>
     </w:p>
     <w:p>
@@ -1274,7 +1274,7 @@
           <w:sz w:val="20"/>
           <w:szCs w:val="20"/>
         </w:rPr>
-        <w:t xml:space="preserve">Databricks Certified Data Engineer Associate</w:t>
+        <w:t xml:space="preserve">Data Engineer Associate</w:t>
       </w:r>
       <w:r>
         <w:rPr>

</xml_diff>